<commit_message>
Rent agreement: rent-free period starts only on the Works Permissions Date
Co-Authored-By: Claude Sonnet 5.5 <noreply@anthropic.com>
</commit_message>
<xml_diff>
--- a/rent-agreement-draft-terms.docx
+++ b/rent-agreement-draft-terms.docx
@@ -437,7 +437,7 @@
                 <w:sz w:val="20"/>
                 <w:szCs w:val="20"/>
               </w:rPr>
-              <w:t xml:space="preserve">Fit-out and approvals period</w:t>
+              <w:t xml:space="preserve">Rent-free period</w:t>
             </w:r>
           </w:p>
         </w:tc>
@@ -469,7 +469,77 @@
                 <w:sz w:val="20"/>
                 <w:szCs w:val="20"/>
               </w:rPr>
-              <w:t xml:space="preserve">[2] months from [date], rent free, extended day for day for delay not caused by the Tenant (clause 8)</w:t>
+              <w:t xml:space="preserve">[2] months, starting only on the Works Permissions Date, when the builder's consent and the panchayat works permission are in the Tenant's hands in writing; extended day for day for delay not caused by the Tenant (clause 8)</w:t>
+            </w:r>
+          </w:p>
+        </w:tc>
+      </w:tr>
+      <w:tr>
+        <w:trPr>
+          <w:cantSplit/>
+          <w:tblHeader w:val="off"/>
+        </w:trPr>
+        <w:tc>
+          <w:tcPr>
+            <w:tcW w:type="dxa" w:w="2800"/>
+            <w:tcBorders>
+              <w:top w:val="single" w:color="BBBBBB" w:sz="4"/>
+              <w:left w:val="single" w:color="BBBBBB" w:sz="4"/>
+              <w:bottom w:val="single" w:color="BBBBBB" w:sz="4"/>
+              <w:right w:val="single" w:color="BBBBBB" w:sz="4"/>
+            </w:tcBorders>
+            <w:tcMar>
+              <w:top w:type="dxa" w:w="70"/>
+              <w:left w:type="dxa" w:w="110"/>
+              <w:bottom w:type="dxa" w:w="70"/>
+              <w:right w:type="dxa" w:w="110"/>
+            </w:tcMar>
+          </w:tcPr>
+          <w:p>
+            <w:pPr>
+              <w:spacing w:after="0"/>
+            </w:pPr>
+            <w:r>
+              <w:rPr>
+                <w:rFonts w:ascii="Calibri" w:cs="Calibri" w:eastAsia="Calibri" w:hAnsi="Calibri"/>
+                <w:b w:val="false"/>
+                <w:bCs w:val="false"/>
+                <w:sz w:val="20"/>
+                <w:szCs w:val="20"/>
+              </w:rPr>
+              <w:t xml:space="preserve">Before the Works Permissions Date</w:t>
+            </w:r>
+          </w:p>
+        </w:tc>
+        <w:tc>
+          <w:tcPr>
+            <w:tcW w:type="dxa" w:w="6226"/>
+            <w:tcBorders>
+              <w:top w:val="single" w:color="BBBBBB" w:sz="4"/>
+              <w:left w:val="single" w:color="BBBBBB" w:sz="4"/>
+              <w:bottom w:val="single" w:color="BBBBBB" w:sz="4"/>
+              <w:right w:val="single" w:color="BBBBBB" w:sz="4"/>
+            </w:tcBorders>
+            <w:tcMar>
+              <w:top w:type="dxa" w:w="70"/>
+              <w:left w:type="dxa" w:w="110"/>
+              <w:bottom w:type="dxa" w:w="70"/>
+              <w:right w:type="dxa" w:w="110"/>
+            </w:tcMar>
+          </w:tcPr>
+          <w:p>
+            <w:pPr>
+              <w:spacing w:after="0"/>
+            </w:pPr>
+            <w:r>
+              <w:rPr>
+                <w:rFonts w:ascii="Calibri" w:cs="Calibri" w:eastAsia="Calibri" w:hAnsi="Calibri"/>
+                <w:b w:val="false"/>
+                <w:bCs w:val="false"/>
+                <w:sz w:val="20"/>
+                <w:szCs w:val="20"/>
+              </w:rPr>
+              <w:t xml:space="preserve">No rent, no lock-in and no term running, even though the agreement is signed (clause 8.2)</w:t>
             </w:r>
           </w:p>
         </w:tc>
@@ -539,7 +609,7 @@
                 <w:sz w:val="20"/>
                 <w:szCs w:val="20"/>
               </w:rPr>
-              <w:t xml:space="preserve">Earlier of excise licence issue, public opening, or end of the extended rent-free period (clause 9)</w:t>
+              <w:t xml:space="preserve">Earlier of excise licence issue, public opening, or end of the extended rent-free period, and never before the Works Permissions Date (clause 9)</w:t>
             </w:r>
           </w:p>
         </w:tc>
@@ -1063,7 +1133,7 @@
         <w:rPr>
           <w:rFonts w:ascii="Calibri" w:cs="Calibri" w:eastAsia="Calibri" w:hAnsi="Calibri"/>
         </w:rPr>
-        <w:t xml:space="preserve">The Owner will give the Tenant the signed consent and plan before the rent-free period starts.</w:t>
+        <w:t xml:space="preserve">The Owner will give the Tenant the signed consent and plan. Until she does, the rent-free period does not start and no rent, lock-in or term runs against the Tenant (clause 8).</w:t>
       </w:r>
     </w:p>
     <w:p>
@@ -1223,7 +1293,23 @@
         <w:rPr>
           <w:rFonts w:ascii="Calibri" w:cs="Calibri" w:eastAsia="Calibri" w:hAnsi="Calibri"/>
         </w:rPr>
-        <w:t xml:space="preserve">any consent from the builder under clauses 9 or 11 of the Deed of Sale (clause 6.3).</w:t>
+        <w:t xml:space="preserve">any consent from the builder under clauses 9 or 11 of the Deed of Sale (clause 6.3);</w:t>
+      </w:r>
+    </w:p>
+    <w:p>
+      <w:pPr>
+        <w:pStyle w:val="ListParagraph"/>
+        <w:numPr>
+          <w:ilvl w:val="0"/>
+          <w:numId w:val="2"/>
+        </w:numPr>
+        <w:spacing w:after="60" w:line="276"/>
+      </w:pPr>
+      <w:r>
+        <w:rPr>
+          <w:rFonts w:ascii="Calibri" w:cs="Calibri" w:eastAsia="Calibri" w:hAnsi="Calibri"/>
+        </w:rPr>
+        <w:t xml:space="preserve">the Village Panchayat's permission for the interior and repair works (clause 8.1).</w:t>
       </w:r>
     </w:p>
     <w:p>
@@ -1247,18 +1333,137 @@
         <w:rPr>
           <w:rFonts w:ascii="Calibri" w:cs="Calibri" w:eastAsia="Calibri" w:hAnsi="Calibri"/>
         </w:rPr>
-        <w:t xml:space="preserve">8. Fit-out and approvals period (rent free)</w:t>
-      </w:r>
-    </w:p>
-    <w:p>
-      <w:pPr>
-        <w:spacing w:after="100" w:line="276"/>
-      </w:pPr>
-      <w:r>
-        <w:rPr>
-          <w:rFonts w:ascii="Calibri" w:cs="Calibri" w:eastAsia="Calibri" w:hAnsi="Calibri"/>
-        </w:rPr>
-        <w:t xml:space="preserve">For [2] months from [date] the Tenant pays no rent and may use the Premises to apply for approvals and carry out the fit-out. This period extends day for day for any delay not caused by the Tenant, including delay by the authorities, by the builder in giving consent, or by the Owner in providing documents. The Tenant pays for electricity and water it actually uses.</w:t>
+        <w:t xml:space="preserve">8. Works Permissions and the rent-free period</w:t>
+      </w:r>
+    </w:p>
+    <w:p>
+      <w:pPr>
+        <w:spacing w:after="80" w:line="276"/>
+        <w:ind w:left="720" w:hanging="360"/>
+      </w:pPr>
+      <w:r>
+        <w:rPr>
+          <w:rFonts w:ascii="Calibri" w:cs="Calibri" w:eastAsia="Calibri" w:hAnsi="Calibri"/>
+        </w:rPr>
+        <w:t xml:space="preserve">8.1 </w:t>
+      </w:r>
+      <w:r>
+        <w:rPr>
+          <w:rFonts w:ascii="Calibri" w:cs="Calibri" w:eastAsia="Calibri" w:hAnsi="Calibri"/>
+          <w:b/>
+          <w:bCs/>
+        </w:rPr>
+        <w:t xml:space="preserve">Works Permissions.</w:t>
+      </w:r>
+      <w:r>
+        <w:rPr>
+          <w:rFonts w:ascii="Calibri" w:cs="Calibri" w:eastAsia="Calibri" w:hAnsi="Calibri"/>
+        </w:rPr>
+        <w:t xml:space="preserve"> In this agreement, "Works Permissions" means, in writing and delivered to the Tenant: (a) the builder's written consent under clause 6.3; (b) the Village Panchayat's permission for the interior and repair works, including the toilet, drains and biodigester; and (c) any other written permission that the law requires before those works begin. The Owner will obtain (a) and sign the NOC the Tenant needs for (b). The Tenant will apply for (b).</w:t>
+      </w:r>
+    </w:p>
+    <w:p>
+      <w:pPr>
+        <w:spacing w:after="80" w:line="276"/>
+        <w:ind w:left="720" w:hanging="360"/>
+      </w:pPr>
+      <w:r>
+        <w:rPr>
+          <w:rFonts w:ascii="Calibri" w:cs="Calibri" w:eastAsia="Calibri" w:hAnsi="Calibri"/>
+        </w:rPr>
+        <w:t xml:space="preserve">8.2 </w:t>
+      </w:r>
+      <w:r>
+        <w:rPr>
+          <w:rFonts w:ascii="Calibri" w:cs="Calibri" w:eastAsia="Calibri" w:hAnsi="Calibri"/>
+          <w:b/>
+          <w:bCs/>
+        </w:rPr>
+        <w:t xml:space="preserve">Signing before the permissions.</w:t>
+      </w:r>
+      <w:r>
+        <w:rPr>
+          <w:rFonts w:ascii="Calibri" w:cs="Calibri" w:eastAsia="Calibri" w:hAnsi="Calibri"/>
+        </w:rPr>
+        <w:t xml:space="preserve"> The parties may sign this agreement before the Works Permissions are obtained. Signing does not start the rent-free period, rent, the lock-in or the term. No rent is payable for the time between the date of this agreement and the Works Permissions Date.</w:t>
+      </w:r>
+    </w:p>
+    <w:p>
+      <w:pPr>
+        <w:spacing w:after="80" w:line="276"/>
+        <w:ind w:left="720" w:hanging="360"/>
+      </w:pPr>
+      <w:r>
+        <w:rPr>
+          <w:rFonts w:ascii="Calibri" w:cs="Calibri" w:eastAsia="Calibri" w:hAnsi="Calibri"/>
+        </w:rPr>
+        <w:t xml:space="preserve">8.3 </w:t>
+      </w:r>
+      <w:r>
+        <w:rPr>
+          <w:rFonts w:ascii="Calibri" w:cs="Calibri" w:eastAsia="Calibri" w:hAnsi="Calibri"/>
+          <w:b/>
+          <w:bCs/>
+        </w:rPr>
+        <w:t xml:space="preserve">When the rent-free period begins.</w:t>
+      </w:r>
+      <w:r>
+        <w:rPr>
+          <w:rFonts w:ascii="Calibri" w:cs="Calibri" w:eastAsia="Calibri" w:hAnsi="Calibri"/>
+        </w:rPr>
+        <w:t xml:space="preserve"> The rent-free period of [2] months begins on the "Works Permissions Date", which is the date on which the last of the Works Permissions has been delivered to the Tenant in writing. During it the Tenant pays no rent, and may carry out the fit-out and pursue its licence applications. The Tenant pays for electricity and water it actually uses.</w:t>
+      </w:r>
+    </w:p>
+    <w:p>
+      <w:pPr>
+        <w:spacing w:after="80" w:line="276"/>
+        <w:ind w:left="720" w:hanging="360"/>
+      </w:pPr>
+      <w:r>
+        <w:rPr>
+          <w:rFonts w:ascii="Calibri" w:cs="Calibri" w:eastAsia="Calibri" w:hAnsi="Calibri"/>
+        </w:rPr>
+        <w:t xml:space="preserve">8.4 </w:t>
+      </w:r>
+      <w:r>
+        <w:rPr>
+          <w:rFonts w:ascii="Calibri" w:cs="Calibri" w:eastAsia="Calibri" w:hAnsi="Calibri"/>
+          <w:b/>
+          <w:bCs/>
+        </w:rPr>
+        <w:t xml:space="preserve">Before the Works Permissions Date.</w:t>
+      </w:r>
+      <w:r>
+        <w:rPr>
+          <w:rFonts w:ascii="Calibri" w:cs="Calibri" w:eastAsia="Calibri" w:hAnsi="Calibri"/>
+        </w:rPr>
+        <w:t xml:space="preserve"> The Tenant may enter the Premises to inspect, measure, plan and file applications, but is not required to start any construction, and none will be started until the Works Permissions Date.</w:t>
+      </w:r>
+    </w:p>
+    <w:p>
+      <w:pPr>
+        <w:spacing w:after="80" w:line="276"/>
+        <w:ind w:left="720" w:hanging="360"/>
+      </w:pPr>
+      <w:r>
+        <w:rPr>
+          <w:rFonts w:ascii="Calibri" w:cs="Calibri" w:eastAsia="Calibri" w:hAnsi="Calibri"/>
+        </w:rPr>
+        <w:t xml:space="preserve">8.5 </w:t>
+      </w:r>
+      <w:r>
+        <w:rPr>
+          <w:rFonts w:ascii="Calibri" w:cs="Calibri" w:eastAsia="Calibri" w:hAnsi="Calibri"/>
+          <w:b/>
+          <w:bCs/>
+        </w:rPr>
+        <w:t xml:space="preserve">Extension.</w:t>
+      </w:r>
+      <w:r>
+        <w:rPr>
+          <w:rFonts w:ascii="Calibri" w:cs="Calibri" w:eastAsia="Calibri" w:hAnsi="Calibri"/>
+        </w:rPr>
+        <w:t xml:space="preserve"> The rent-free period extends day for day for any delay not caused by the Tenant, including delay by the authorities, by the builder in giving consent, or by the Owner in providing documents.</w:t>
       </w:r>
     </w:p>
     <w:p>
@@ -1281,7 +1486,7 @@
           <w:i/>
           <w:iCs/>
         </w:rPr>
-        <w:t xml:space="preserve"> after the first [2] months the rent is [50]% of the monthly rent until the excise licence is issued or the shop opens, whichever is earlier.</w:t>
+        <w:t xml:space="preserve"> after the first [2] months of the rent-free period the rent is [50]% of the monthly rent until the excise licence is issued or the shop opens, whichever is earlier.</w:t>
       </w:r>
     </w:p>
     <w:p>
@@ -1305,7 +1510,7 @@
         <w:rPr>
           <w:rFonts w:ascii="Calibri" w:cs="Calibri" w:eastAsia="Calibri" w:hAnsi="Calibri"/>
         </w:rPr>
-        <w:t xml:space="preserve">Rent starts on the earliest of: (a) the date the excise licence is issued; (b) the date the shop opens to the public; or (c) the end of the extended rent-free period in clause 8. The term of [11] months runs from that date. The rent-free period does not count against the term.</w:t>
+        <w:t xml:space="preserve">Rent starts on the earliest of: (a) the date the excise licence is issued; (b) the date the shop opens to the public; or (c) the end of the extended rent-free period in clause 8.5. Rent never starts before the Works Permissions Date. The term of [11] months runs from the rent start date. Neither the time before the Works Permissions Date nor the rent-free period counts against the term.</w:t>
       </w:r>
     </w:p>
     <w:p>

</xml_diff>